<commit_message>
docs: correct published PZ06 report link
</commit_message>
<xml_diff>
--- a/reports/word/pz06.docx
+++ b/reports/word/pz06.docx
@@ -840,7 +840,9 @@
       </w:r>
     </w:p>
     <w:p>
-      <w:pPr/>
+      <w:pPr>
+        <w:keepNext/>
+      </w:pPr>
       <w:r>
         <w:t>Фактически выполнены локальные статические проверки:</w:t>
       </w:r>
@@ -848,6 +850,7 @@
     <w:p>
       <w:pPr>
         <w:pStyle w:val="Code"/>
+        <w:keepNext/>
       </w:pPr>
       <w:r>
         <w:t>go fmt ./...      — выполнено</w:t>
@@ -856,6 +859,7 @@
     <w:p>
       <w:pPr>
         <w:pStyle w:val="Code"/>
+        <w:keepNext/>
       </w:pPr>
       <w:r>
         <w:t>go vet ./...      — без замечаний</w:t>
@@ -864,6 +868,7 @@
     <w:p>
       <w:pPr>
         <w:pStyle w:val="Code"/>
+        <w:keepNext/>
       </w:pPr>
       <w:r>
         <w:t>go test ./...     — ok internal/http; cmd/server, internal/db и internal/models компилируются</w:t>
@@ -872,6 +877,7 @@
     <w:p>
       <w:pPr>
         <w:pStyle w:val="Code"/>
+        <w:keepNext/>
       </w:pPr>
       <w:r>
         <w:t>go build ./...    — успешно</w:t>
@@ -880,6 +886,7 @@
     <w:p>
       <w:pPr>
         <w:pStyle w:val="Code"/>
+        <w:keepNext w:val="0"/>
       </w:pPr>
       <w:r>
         <w:t>go mod verify     — all modules verified</w:t>
@@ -2237,11 +2244,11 @@
           <w:rPr>
             <w:color w:val="195A85"/>
           </w:rPr>
-          <w:t>Репозиторий проекта</w:t>
+          <w:t>Практика №6 на GitHub</w:t>
         </w:r>
       </w:hyperlink>
       <w:r>
-        <w:t xml:space="preserve"> (изменения PZ06 появятся после push подготовленных локальных коммитов).</w:t>
+        <w:t>.</w:t>
       </w:r>
     </w:p>
     <w:sectPr>

</xml_diff>